<commit_message>
Edit and create Indumentary
</commit_message>
<xml_diff>
--- a/public/templates/nueva.docx
+++ b/public/templates/nueva.docx
@@ -753,15 +753,37 @@
             </w:tcBorders>
           </w:tcPr>
           <w:p>
-            <w:r>
+            <w:pPr>
+              <w:rPr>
+                <w:rFonts w:ascii="Arial" w:hAnsi="Arial" w:cs="Arial"/>
+                <w:sz w:val="22"/>
+                <w:szCs w:val="22"/>
+              </w:rPr>
+            </w:pPr>
+            <w:r>
+              <w:rPr>
+                <w:rFonts w:ascii="Arial" w:hAnsi="Arial" w:cs="Arial"/>
+                <w:sz w:val="22"/>
+                <w:szCs w:val="22"/>
+              </w:rPr>
               <w:t>${</w:t>
             </w:r>
             <w:proofErr w:type="spellStart"/>
             <w:r>
+              <w:rPr>
+                <w:rFonts w:ascii="Arial" w:hAnsi="Arial" w:cs="Arial"/>
+                <w:sz w:val="22"/>
+                <w:szCs w:val="22"/>
+              </w:rPr>
               <w:t>descripcion</w:t>
             </w:r>
             <w:proofErr w:type="spellEnd"/>
             <w:r>
+              <w:rPr>
+                <w:rFonts w:ascii="Arial" w:hAnsi="Arial" w:cs="Arial"/>
+                <w:sz w:val="22"/>
+                <w:szCs w:val="22"/>
+              </w:rPr>
               <w:t>}</w:t>
             </w:r>
           </w:p>
@@ -1074,11 +1096,16 @@
               <w:rPr>
                 <w:rFonts w:ascii="Arial" w:hAnsi="Arial" w:cs="Arial"/>
                 <w:color w:val="000000"/>
-                <w:sz w:val="20"/>
-                <w:szCs w:val="20"/>
-              </w:rPr>
-            </w:pPr>
-            <w:r>
+                <w:sz w:val="22"/>
+                <w:szCs w:val="22"/>
+              </w:rPr>
+            </w:pPr>
+            <w:r>
+              <w:rPr>
+                <w:rFonts w:ascii="Arial" w:hAnsi="Arial" w:cs="Arial"/>
+                <w:sz w:val="22"/>
+                <w:szCs w:val="22"/>
+              </w:rPr>
               <w:t>${no}</w:t>
             </w:r>
           </w:p>
@@ -1099,19 +1126,34 @@
               <w:jc w:val="both"/>
               <w:rPr>
                 <w:rFonts w:ascii="Arial" w:hAnsi="Arial" w:cs="Arial"/>
-                <w:sz w:val="20"/>
-                <w:szCs w:val="20"/>
-              </w:rPr>
-            </w:pPr>
-            <w:r>
+                <w:sz w:val="22"/>
+                <w:szCs w:val="22"/>
+              </w:rPr>
+            </w:pPr>
+            <w:r>
+              <w:rPr>
+                <w:rFonts w:ascii="Arial" w:hAnsi="Arial" w:cs="Arial"/>
+                <w:sz w:val="22"/>
+                <w:szCs w:val="22"/>
+              </w:rPr>
               <w:t>${</w:t>
             </w:r>
             <w:proofErr w:type="spellStart"/>
             <w:r>
+              <w:rPr>
+                <w:rFonts w:ascii="Arial" w:hAnsi="Arial" w:cs="Arial"/>
+                <w:sz w:val="22"/>
+                <w:szCs w:val="22"/>
+              </w:rPr>
               <w:t>descripcion_nc</w:t>
             </w:r>
             <w:proofErr w:type="spellEnd"/>
             <w:r>
+              <w:rPr>
+                <w:rFonts w:ascii="Arial" w:hAnsi="Arial" w:cs="Arial"/>
+                <w:sz w:val="22"/>
+                <w:szCs w:val="22"/>
+              </w:rPr>
               <w:t>}</w:t>
             </w:r>
           </w:p>
@@ -1131,11 +1173,16 @@
               <w:rPr>
                 <w:rFonts w:ascii="Arial" w:hAnsi="Arial" w:cs="Arial"/>
                 <w:color w:val="000000"/>
-                <w:sz w:val="20"/>
-                <w:szCs w:val="20"/>
-              </w:rPr>
-            </w:pPr>
-            <w:r>
+                <w:sz w:val="22"/>
+                <w:szCs w:val="22"/>
+              </w:rPr>
+            </w:pPr>
+            <w:r>
+              <w:rPr>
+                <w:rFonts w:ascii="Arial" w:hAnsi="Arial" w:cs="Arial"/>
+                <w:sz w:val="22"/>
+                <w:szCs w:val="22"/>
+              </w:rPr>
               <w:t>${evidencia}</w:t>
             </w:r>
           </w:p>
@@ -1156,19 +1203,34 @@
               <w:rPr>
                 <w:rFonts w:ascii="Arial" w:hAnsi="Arial" w:cs="Arial"/>
                 <w:color w:val="000000"/>
-                <w:sz w:val="20"/>
-                <w:szCs w:val="20"/>
-              </w:rPr>
-            </w:pPr>
-            <w:r>
+                <w:sz w:val="22"/>
+                <w:szCs w:val="22"/>
+              </w:rPr>
+            </w:pPr>
+            <w:r>
+              <w:rPr>
+                <w:rFonts w:ascii="Arial" w:hAnsi="Arial" w:cs="Arial"/>
+                <w:sz w:val="22"/>
+                <w:szCs w:val="22"/>
+              </w:rPr>
               <w:t>${</w:t>
             </w:r>
             <w:proofErr w:type="spellStart"/>
             <w:r>
+              <w:rPr>
+                <w:rFonts w:ascii="Arial" w:hAnsi="Arial" w:cs="Arial"/>
+                <w:sz w:val="22"/>
+                <w:szCs w:val="22"/>
+              </w:rPr>
               <w:t>reg_iso</w:t>
             </w:r>
             <w:proofErr w:type="spellEnd"/>
             <w:r>
+              <w:rPr>
+                <w:rFonts w:ascii="Arial" w:hAnsi="Arial" w:cs="Arial"/>
+                <w:sz w:val="22"/>
+                <w:szCs w:val="22"/>
+              </w:rPr>
               <w:t>}</w:t>
             </w:r>
           </w:p>
@@ -1189,11 +1251,16 @@
               <w:rPr>
                 <w:rFonts w:ascii="Arial" w:hAnsi="Arial" w:cs="Arial"/>
                 <w:color w:val="000000"/>
-                <w:sz w:val="20"/>
-                <w:szCs w:val="20"/>
-              </w:rPr>
-            </w:pPr>
-            <w:r>
+                <w:sz w:val="22"/>
+                <w:szCs w:val="22"/>
+              </w:rPr>
+            </w:pPr>
+            <w:r>
+              <w:rPr>
+                <w:rFonts w:ascii="Arial" w:hAnsi="Arial" w:cs="Arial"/>
+                <w:sz w:val="22"/>
+                <w:szCs w:val="22"/>
+              </w:rPr>
               <w:t>${tipo}</w:t>
             </w:r>
           </w:p>

</xml_diff>